<commit_message>
docs: actualizar entregable .docx
</commit_message>
<xml_diff>
--- a/docs/entrega-1/E1_grupo06_informe.docx
+++ b/docs/entrega-1/E1_grupo06_informe.docx
@@ -68,7 +68,7 @@
                     <pic:cNvPicPr/>
                   </pic:nvPicPr>
                   <pic:blipFill>
-                    <a:blip r:embed="rId10"/>
+                    <a:blip r:embed="rId13"/>
                     <a:stretch>
                       <a:fillRect/>
                     </a:stretch>
@@ -810,9 +810,10 @@
             </w:pPr>
             <w:r>
               <w:rPr>
-                <w:rFonts w:ascii="Calibri" w:cs="Calibri"/>
+                <w:rFonts w:ascii="Calibri" w:hAnsi="Calibri" w:eastAsia="Calibri" w:cs="Calibri"/>
                 <w:b/>
                 <w:bCs/>
+                <w:color w:val="1f1f1f"/>
                 <w:sz w:val="18"/>
                 <w:szCs w:val="18"/>
               </w:rPr>
@@ -838,7 +839,16 @@
             <w:vAlign w:val="center"/>
           </w:tcPr>
           <w:p>
-            <w:r>
+            <w:pPr>
+              <w:spacing w:after="120" w:line="269" w:lineRule="auto"/>
+            </w:pPr>
+            <w:r>
+              <w:rPr>
+                <w:rFonts w:ascii="Calibri" w:hAnsi="Calibri" w:eastAsia="Calibri" w:cs="Calibri"/>
+                <w:color w:val="1f1f1f"/>
+                <w:sz w:val="21"/>
+                <w:szCs w:val="21"/>
+              </w:rPr>
               <w:t>https://github.com/LukasGarrido/TAS</w:t>
             </w:r>
           </w:p>
@@ -890,9 +900,7 @@
       <w:pPr>
         <w:pageBreakBefore/>
       </w:pPr>
-      <w:r>
-        <w:lastRenderedPageBreak/>
-      </w:r>
+      <w:r/>
       <w:r>
         <w:rPr>
           <w:rtl w:val="0"/>
@@ -1031,6 +1039,12 @@
         <w:spacing w:after="160" w:line="276" w:lineRule="auto"/>
       </w:pPr>
       <w:r>
+        <w:rPr>
+          <w:rFonts w:ascii="Calibri" w:hAnsi="Calibri" w:eastAsia="Calibri" w:cs="Calibri"/>
+          <w:color w:val="1f1f1f"/>
+          <w:sz w:val="21"/>
+          <w:szCs w:val="21"/>
+        </w:rPr>
         <w:t>Nodo Sur es una red regional que agrupa pequeñas marcas, talleres creativos, productores y operadores de experiencias, quienes actualmente gestionan sus ventas, reservas, inscripciones y atención a clientes mediante las redes sociales, con formularios aislados y mensajería. Actualmente esta modalidad de operación dificulta la centralización de la información, aumenta el riesgo de perdida de datos y genera problemas de disponibilidad de servicios.</w:t>
       </w:r>
     </w:p>
@@ -1039,47 +1053,90 @@
         <w:spacing w:after="160" w:line="276" w:lineRule="auto"/>
       </w:pPr>
       <w:r>
+        <w:rPr>
+          <w:rFonts w:ascii="Calibri" w:hAnsi="Calibri" w:eastAsia="Calibri" w:cs="Calibri"/>
+          <w:color w:val="1f1f1f"/>
+          <w:sz w:val="21"/>
+          <w:szCs w:val="21"/>
+        </w:rPr>
         <w:t xml:space="preserve">El proyecto tiene como fin el diseñar e implementar una plataforma digital, la cual sea </w:t>
       </w:r>
       <w:r>
         <w:rPr>
+          <w:rFonts w:ascii="Calibri" w:hAnsi="Calibri" w:eastAsia="Calibri" w:cs="Calibri"/>
           <w:i/>
           <w:iCs/>
+          <w:color w:val="1f1f1f"/>
+          <w:sz w:val="21"/>
+          <w:szCs w:val="21"/>
         </w:rPr>
         <w:t>centralizada, administrable</w:t>
       </w:r>
       <w:r>
+        <w:rPr>
+          <w:rFonts w:ascii="Calibri" w:hAnsi="Calibri" w:eastAsia="Calibri" w:cs="Calibri"/>
+          <w:color w:val="1f1f1f"/>
+          <w:sz w:val="21"/>
+          <w:szCs w:val="21"/>
+        </w:rPr>
         <w:t xml:space="preserve"> y </w:t>
       </w:r>
       <w:r>
         <w:rPr>
+          <w:rFonts w:ascii="Calibri" w:hAnsi="Calibri" w:eastAsia="Calibri" w:cs="Calibri"/>
           <w:i/>
           <w:iCs/>
+          <w:color w:val="1f1f1f"/>
+          <w:sz w:val="21"/>
+          <w:szCs w:val="21"/>
         </w:rPr>
         <w:t>resiliente</w:t>
       </w:r>
       <w:r>
+        <w:rPr>
+          <w:rFonts w:ascii="Calibri" w:hAnsi="Calibri" w:eastAsia="Calibri" w:cs="Calibri"/>
+          <w:color w:val="1f1f1f"/>
+          <w:sz w:val="21"/>
+          <w:szCs w:val="21"/>
+        </w:rPr>
         <w:t xml:space="preserve"> que permita a distintos miembros de Nodo Sur publicar sus productos y experiencias, gestionar pedidos y reservas, ofrecer contenidos y mantener comunicación con sus clientes </w:t>
       </w:r>
       <w:r>
         <w:rPr>
+          <w:rFonts w:ascii="Calibri" w:hAnsi="Calibri" w:eastAsia="Calibri" w:cs="Calibri"/>
           <w:b/>
           <w:bCs/>
+          <w:color w:val="1f1f1f"/>
+          <w:sz w:val="21"/>
+          <w:szCs w:val="21"/>
         </w:rPr>
         <w:t>desde un único dominio</w:t>
       </w:r>
       <w:r>
+        <w:rPr>
+          <w:rFonts w:ascii="Calibri" w:hAnsi="Calibri" w:eastAsia="Calibri" w:cs="Calibri"/>
+          <w:color w:val="1f1f1f"/>
+          <w:sz w:val="21"/>
+          <w:szCs w:val="21"/>
+        </w:rPr>
         <w:t xml:space="preserve">, </w:t>
       </w:r>
       <w:r>
         <w:rPr>
-          <w:rFonts w:ascii="Calibri" w:cs="Calibri"/>
+          <w:rFonts w:ascii="Calibri" w:hAnsi="Calibri" w:eastAsia="Calibri" w:cs="Calibri"/>
+          <w:color w:val="1f1f1f"/>
           <w:sz w:val="21"/>
           <w:szCs w:val="21"/>
         </w:rPr>
         <w:t>manteniendo la continuidad del servicio incluso ante la falla de uno de los nodos.</w:t>
       </w:r>
       <w:r>
+        <w:rPr>
+          <w:rFonts w:ascii="Calibri" w:hAnsi="Calibri" w:eastAsia="Calibri" w:cs="Calibri"/>
+          <w:color w:val="1f1f1f"/>
+          <w:sz w:val="21"/>
+          <w:szCs w:val="21"/>
+        </w:rPr>
         <w:t xml:space="preserve">  </w:t>
       </w:r>
     </w:p>
@@ -3572,7 +3629,7 @@
                     <pic:cNvPicPr/>
                   </pic:nvPicPr>
                   <pic:blipFill>
-                    <a:blip r:embed="rId11"/>
+                    <a:blip r:embed="rId14"/>
                     <a:stretch>
                       <a:fillRect/>
                     </a:stretch>
@@ -3641,7 +3698,7 @@
                     <pic:cNvPicPr/>
                   </pic:nvPicPr>
                   <pic:blipFill>
-                    <a:blip r:embed="rId12"/>
+                    <a:blip r:embed="rId15"/>
                     <a:stretch>
                       <a:fillRect/>
                     </a:stretch>
@@ -6274,26 +6331,6 @@
       <w:pPr>
         <w:spacing w:after="120" w:line="269" w:lineRule="auto"/>
       </w:pPr>
-    </w:p>
-    <w:p>
-      <w:pPr>
-        <w:spacing w:after="120" w:line="269" w:lineRule="auto"/>
-      </w:pPr>
-    </w:p>
-    <w:p>
-      <w:pPr>
-        <w:spacing w:after="120" w:line="269" w:lineRule="auto"/>
-      </w:pPr>
-    </w:p>
-    <w:p>
-      <w:pPr>
-        <w:spacing w:after="120" w:line="269" w:lineRule="auto"/>
-      </w:pPr>
-    </w:p>
-    <w:p>
-      <w:pPr>
-        <w:spacing w:after="120" w:line="269" w:lineRule="auto"/>
-      </w:pPr>
       <w:r>
         <w:rPr>
           <w:rFonts w:ascii="Calibri" w:hAnsi="Calibri" w:eastAsia="Calibri" w:cs="Calibri"/>
@@ -6512,21 +6549,6 @@
         </w:rPr>
         <w:t>Mientras no se resuelva la persistencia de archivos compartidos entre backends (ver sección de Consideraciones de Recursos), existe el riesgo de que un cliente perciba inconsistencias , por ejemplo, una imagen de catálogo visible desde un backend pero no desde el otro. Corregir esta brecha es una condición de usabilidad antes de escalar a dos backends.</w:t>
       </w:r>
-    </w:p>
-    <w:p>
-      <w:pPr>
-        <w:spacing w:after="160" w:line="276" w:lineRule="auto"/>
-      </w:pPr>
-    </w:p>
-    <w:p>
-      <w:pPr>
-        <w:spacing w:after="160" w:line="276" w:lineRule="auto"/>
-      </w:pPr>
-    </w:p>
-    <w:p>
-      <w:pPr>
-        <w:spacing w:after="160" w:line="276" w:lineRule="auto"/>
-      </w:pPr>
     </w:p>
     <w:p>
       <w:pPr>
@@ -8186,7 +8208,7 @@
         <wp:inline distT="0" distB="0" distL="0" distR="0">
           <wp:extent cx="310896" cy="274707"/>
           <wp:effectExtent l="0" t="0" r="0" b="0"/>
-          <wp:docPr id="2" name="image1.png" descr="Escudo institucional de la Universidad Técnica Federico Santa María"/>
+          <wp:docPr id="2" name="image10.png" descr="Escudo institucional de la Universidad Técnica Federico Santa María"/>
           <wp:cNvGraphicFramePr>
             <a:graphicFrameLocks xmlns:a="http://schemas.openxmlformats.org/drawingml/2006/main" noChangeAspect="1"/>
           </wp:cNvGraphicFramePr>
@@ -8194,11 +8216,11 @@
             <a:graphicData uri="http://schemas.openxmlformats.org/drawingml/2006/picture">
               <pic:pic xmlns:pic="http://schemas.openxmlformats.org/drawingml/2006/picture">
                 <pic:nvPicPr>
-                  <pic:cNvPr id="2" name="image1.png" descr="Escudo institucional de la Universidad Técnica Federico Santa María"/>
+                  <pic:cNvPr id="2" name="image10.png" descr="Escudo institucional de la Universidad Técnica Federico Santa María"/>
                   <pic:cNvPicPr/>
                 </pic:nvPicPr>
                 <pic:blipFill>
-                  <a:blip r:embed="rId2"/>
+                  <a:blip r:embed="rId3"/>
                   <a:stretch>
                     <a:fillRect/>
                   </a:stretch>

</xml_diff>